<commit_message>
feat: redesign home dashboard layout and enforce database authentication
</commit_message>
<xml_diff>
--- a/機能構造図.docx
+++ b/機能構造図.docx
@@ -6,30 +6,23 @@
       <w:pPr>
         <w:jc w:val="center"/>
         <w:rPr>
+          <w:sz w:val="44"/>
+          <w:szCs w:val="44"/>
+        </w:rPr>
+      </w:pPr>
+      <w:r>
+        <w:rPr>
           <w:rFonts w:hint="eastAsia"/>
           <w:sz w:val="44"/>
           <w:szCs w:val="44"/>
         </w:rPr>
-      </w:pPr>
-      <w:r>
-        <w:rPr>
-          <w:rFonts w:hint="eastAsia"/>
-          <w:sz w:val="44"/>
-          <w:szCs w:val="44"/>
-        </w:rPr>
         <w:t>追加するシステム</w:t>
       </w:r>
     </w:p>
-    <w:p>
-      <w:pPr>
-        <w:rPr>
-          <w:rFonts w:hint="eastAsia"/>
-        </w:rPr>
-      </w:pPr>
-    </w:p>
-    <w:p>
-      <w:pPr>
-        <w:pStyle w:val="a9"/>
+    <w:p/>
+    <w:p>
+      <w:pPr>
+        <w:pStyle w:val="ListParagraph"/>
         <w:numPr>
           <w:ilvl w:val="0"/>
           <w:numId w:val="1"/>
@@ -49,7 +42,7 @@
     </w:p>
     <w:p>
       <w:pPr>
-        <w:pStyle w:val="a9"/>
+        <w:pStyle w:val="ListParagraph"/>
         <w:ind w:left="360"/>
       </w:pPr>
       <w:r>
@@ -104,7 +97,7 @@
     <w:p/>
     <w:p>
       <w:pPr>
-        <w:pStyle w:val="a9"/>
+        <w:pStyle w:val="ListParagraph"/>
         <w:numPr>
           <w:ilvl w:val="0"/>
           <w:numId w:val="1"/>
@@ -172,16 +165,10 @@
     <w:p/>
     <w:p/>
     <w:p/>
-    <w:p>
-      <w:pPr>
-        <w:rPr>
-          <w:rFonts w:hint="eastAsia"/>
-        </w:rPr>
-      </w:pPr>
-    </w:p>
-    <w:p>
-      <w:pPr>
-        <w:pStyle w:val="a9"/>
+    <w:p/>
+    <w:p>
+      <w:pPr>
+        <w:pStyle w:val="ListParagraph"/>
         <w:numPr>
           <w:ilvl w:val="0"/>
           <w:numId w:val="1"/>
@@ -260,27 +247,16 @@
       </w:r>
     </w:p>
     <w:p>
-      <w:pPr>
-        <w:rPr>
-          <w:rFonts w:hint="eastAsia"/>
-        </w:rPr>
-      </w:pPr>
       <w:r>
         <w:t>• 選択された項目の顧客管理フラグを０から２に更新 する。</w:t>
       </w:r>
     </w:p>
     <w:p/>
     <w:p/>
-    <w:p>
-      <w:pPr>
-        <w:rPr>
-          <w:rFonts w:hint="eastAsia"/>
-        </w:rPr>
-      </w:pPr>
-    </w:p>
-    <w:p>
-      <w:pPr>
-        <w:pStyle w:val="a9"/>
+    <w:p/>
+    <w:p>
+      <w:pPr>
+        <w:pStyle w:val="ListParagraph"/>
         <w:numPr>
           <w:ilvl w:val="0"/>
           <w:numId w:val="1"/>
@@ -311,7 +287,7 @@
     </w:p>
     <w:p>
       <w:pPr>
-        <w:pStyle w:val="a9"/>
+        <w:pStyle w:val="ListParagraph"/>
         <w:numPr>
           <w:ilvl w:val="1"/>
           <w:numId w:val="1"/>
@@ -380,16 +356,10 @@
     <w:p/>
     <w:p/>
     <w:p/>
-    <w:p>
-      <w:pPr>
-        <w:rPr>
-          <w:rFonts w:hint="eastAsia"/>
-        </w:rPr>
-      </w:pPr>
-    </w:p>
-    <w:p>
-      <w:pPr>
-        <w:pStyle w:val="a9"/>
+    <w:p/>
+    <w:p>
+      <w:pPr>
+        <w:pStyle w:val="ListParagraph"/>
         <w:numPr>
           <w:ilvl w:val="0"/>
           <w:numId w:val="1"/>
@@ -415,7 +385,7 @@
     </w:p>
     <w:p>
       <w:pPr>
-        <w:pStyle w:val="a9"/>
+        <w:pStyle w:val="ListParagraph"/>
         <w:numPr>
           <w:ilvl w:val="1"/>
           <w:numId w:val="1"/>
@@ -432,7 +402,7 @@
     </w:p>
     <w:p>
       <w:pPr>
-        <w:pStyle w:val="a9"/>
+        <w:pStyle w:val="ListParagraph"/>
         <w:numPr>
           <w:ilvl w:val="1"/>
           <w:numId w:val="1"/>
@@ -449,7 +419,7 @@
     </w:p>
     <w:p>
       <w:pPr>
-        <w:pStyle w:val="a9"/>
+        <w:pStyle w:val="ListParagraph"/>
         <w:numPr>
           <w:ilvl w:val="1"/>
           <w:numId w:val="1"/>
@@ -471,7 +441,7 @@
     </w:p>
     <w:p>
       <w:pPr>
-        <w:pStyle w:val="a9"/>
+        <w:pStyle w:val="ListParagraph"/>
         <w:numPr>
           <w:ilvl w:val="1"/>
           <w:numId w:val="1"/>
@@ -485,25 +455,16 @@
     </w:p>
     <w:p>
       <w:pPr>
-        <w:pStyle w:val="a9"/>
+        <w:pStyle w:val="ListParagraph"/>
         <w:ind w:left="360"/>
-        <w:rPr>
-          <w:rFonts w:hint="eastAsia"/>
-        </w:rPr>
-      </w:pPr>
-    </w:p>
-    <w:p/>
-    <w:p/>
-    <w:p>
-      <w:pPr>
-        <w:rPr>
-          <w:rFonts w:hint="eastAsia"/>
-        </w:rPr>
-      </w:pPr>
-    </w:p>
-    <w:p>
-      <w:pPr>
-        <w:pStyle w:val="a9"/>
+      </w:pPr>
+    </w:p>
+    <w:p/>
+    <w:p/>
+    <w:p/>
+    <w:p>
+      <w:pPr>
+        <w:pStyle w:val="ListParagraph"/>
         <w:numPr>
           <w:ilvl w:val="0"/>
           <w:numId w:val="1"/>
@@ -528,7 +489,7 @@
     </w:p>
     <w:p>
       <w:pPr>
-        <w:pStyle w:val="a9"/>
+        <w:pStyle w:val="ListParagraph"/>
         <w:numPr>
           <w:ilvl w:val="1"/>
           <w:numId w:val="1"/>
@@ -550,7 +511,7 @@
     </w:p>
     <w:p>
       <w:pPr>
-        <w:pStyle w:val="a9"/>
+        <w:pStyle w:val="ListParagraph"/>
         <w:numPr>
           <w:ilvl w:val="1"/>
           <w:numId w:val="1"/>
@@ -591,26 +552,14 @@
       </w:r>
     </w:p>
     <w:p/>
-    <w:p>
-      <w:pPr>
-        <w:rPr>
-          <w:rFonts w:hint="eastAsia"/>
-        </w:rPr>
-      </w:pPr>
-    </w:p>
-    <w:p/>
-    <w:p/>
-    <w:p/>
-    <w:p>
-      <w:pPr>
-        <w:rPr>
-          <w:rFonts w:hint="eastAsia"/>
-        </w:rPr>
-      </w:pPr>
-    </w:p>
-    <w:p>
-      <w:pPr>
-        <w:pStyle w:val="a9"/>
+    <w:p/>
+    <w:p/>
+    <w:p/>
+    <w:p/>
+    <w:p/>
+    <w:p>
+      <w:pPr>
+        <w:pStyle w:val="ListParagraph"/>
         <w:numPr>
           <w:ilvl w:val="0"/>
           <w:numId w:val="1"/>
@@ -636,7 +585,7 @@
     </w:p>
     <w:p>
       <w:pPr>
-        <w:pStyle w:val="a9"/>
+        <w:pStyle w:val="ListParagraph"/>
         <w:numPr>
           <w:ilvl w:val="1"/>
           <w:numId w:val="1"/>
@@ -653,7 +602,7 @@
     </w:p>
     <w:p>
       <w:pPr>
-        <w:pStyle w:val="a9"/>
+        <w:pStyle w:val="ListParagraph"/>
         <w:numPr>
           <w:ilvl w:val="1"/>
           <w:numId w:val="1"/>
@@ -670,7 +619,7 @@
     </w:p>
     <w:p>
       <w:pPr>
-        <w:pStyle w:val="a9"/>
+        <w:pStyle w:val="ListParagraph"/>
         <w:numPr>
           <w:ilvl w:val="1"/>
           <w:numId w:val="1"/>
@@ -682,7 +631,7 @@
     </w:p>
     <w:p>
       <w:pPr>
-        <w:pStyle w:val="a9"/>
+        <w:pStyle w:val="ListParagraph"/>
         <w:numPr>
           <w:ilvl w:val="1"/>
           <w:numId w:val="1"/>
@@ -694,16 +643,10 @@
     </w:p>
     <w:p/>
     <w:p/>
-    <w:p>
-      <w:pPr>
-        <w:rPr>
-          <w:rFonts w:hint="eastAsia"/>
-        </w:rPr>
-      </w:pPr>
-    </w:p>
-    <w:p>
-      <w:pPr>
-        <w:pStyle w:val="a9"/>
+    <w:p/>
+    <w:p>
+      <w:pPr>
+        <w:pStyle w:val="ListParagraph"/>
         <w:numPr>
           <w:ilvl w:val="0"/>
           <w:numId w:val="1"/>
@@ -728,7 +671,7 @@
     </w:p>
     <w:p>
       <w:pPr>
-        <w:pStyle w:val="a9"/>
+        <w:pStyle w:val="ListParagraph"/>
         <w:numPr>
           <w:ilvl w:val="1"/>
           <w:numId w:val="1"/>
@@ -745,7 +688,7 @@
     </w:p>
     <w:p>
       <w:pPr>
-        <w:pStyle w:val="a9"/>
+        <w:pStyle w:val="ListParagraph"/>
         <w:numPr>
           <w:ilvl w:val="1"/>
           <w:numId w:val="1"/>
@@ -762,7 +705,7 @@
     </w:p>
     <w:p>
       <w:pPr>
-        <w:pStyle w:val="a9"/>
+        <w:pStyle w:val="ListParagraph"/>
         <w:numPr>
           <w:ilvl w:val="1"/>
           <w:numId w:val="1"/>
@@ -779,7 +722,7 @@
     </w:p>
     <w:p>
       <w:pPr>
-        <w:pStyle w:val="a9"/>
+        <w:pStyle w:val="ListParagraph"/>
         <w:numPr>
           <w:ilvl w:val="1"/>
           <w:numId w:val="1"/>
@@ -796,7 +739,7 @@
     </w:p>
     <w:p>
       <w:pPr>
-        <w:pStyle w:val="a9"/>
+        <w:pStyle w:val="ListParagraph"/>
         <w:numPr>
           <w:ilvl w:val="1"/>
           <w:numId w:val="1"/>
@@ -824,17 +767,11 @@
     <w:p/>
     <w:p/>
     <w:p/>
-    <w:p>
-      <w:pPr>
-        <w:rPr>
-          <w:rFonts w:hint="eastAsia"/>
-        </w:rPr>
-      </w:pPr>
-    </w:p>
-    <w:p/>
-    <w:p>
-      <w:pPr>
-        <w:pStyle w:val="a9"/>
+    <w:p/>
+    <w:p/>
+    <w:p>
+      <w:pPr>
+        <w:pStyle w:val="ListParagraph"/>
         <w:numPr>
           <w:ilvl w:val="0"/>
           <w:numId w:val="1"/>
@@ -860,7 +797,7 @@
     </w:p>
     <w:p>
       <w:pPr>
-        <w:pStyle w:val="a9"/>
+        <w:pStyle w:val="ListParagraph"/>
         <w:numPr>
           <w:ilvl w:val="1"/>
           <w:numId w:val="1"/>
@@ -912,16 +849,10 @@
     </w:p>
     <w:p/>
     <w:p/>
-    <w:p>
-      <w:pPr>
-        <w:rPr>
-          <w:rFonts w:hint="eastAsia"/>
-        </w:rPr>
-      </w:pPr>
-    </w:p>
-    <w:p>
-      <w:pPr>
-        <w:pStyle w:val="a9"/>
+    <w:p/>
+    <w:p>
+      <w:pPr>
+        <w:pStyle w:val="ListParagraph"/>
         <w:numPr>
           <w:ilvl w:val="0"/>
           <w:numId w:val="1"/>
@@ -1005,13 +936,7 @@
     <w:p/>
     <w:p/>
     <w:p/>
-    <w:p>
-      <w:pPr>
-        <w:rPr>
-          <w:rFonts w:hint="eastAsia"/>
-        </w:rPr>
-      </w:pPr>
-    </w:p>
+    <w:p/>
     <w:p>
       <w:pPr>
         <w:rPr>
@@ -1080,13 +1005,7 @@
     </w:p>
     <w:p/>
     <w:p/>
-    <w:p>
-      <w:pPr>
-        <w:rPr>
-          <w:rFonts w:hint="eastAsia"/>
-        </w:rPr>
-      </w:pPr>
-    </w:p>
+    <w:p/>
     <w:p>
       <w:pPr>
         <w:rPr>
@@ -1159,13 +1078,7 @@
     <w:p/>
     <w:p/>
     <w:p/>
-    <w:p>
-      <w:pPr>
-        <w:rPr>
-          <w:rFonts w:hint="eastAsia"/>
-        </w:rPr>
-      </w:pPr>
-    </w:p>
+    <w:p/>
     <w:p>
       <w:pPr>
         <w:rPr>
@@ -1234,81 +1147,122 @@
     </w:p>
     <w:p/>
     <w:p/>
+    <w:p/>
+    <w:p>
+      <w:pPr>
+        <w:rPr>
+          <w:sz w:val="36"/>
+          <w:szCs w:val="36"/>
+        </w:rPr>
+      </w:pPr>
+      <w:r>
+        <w:rPr>
+          <w:sz w:val="36"/>
+          <w:szCs w:val="36"/>
+        </w:rPr>
+        <w:t xml:space="preserve">14.0 出荷管理 </w:t>
+      </w:r>
+    </w:p>
+    <w:p>
+      <w:r>
+        <w:t xml:space="preserve">• 商品を営業所から顧客に配達する。 </w:t>
+      </w:r>
+    </w:p>
+    <w:p>
+      <w:r>
+        <w:t xml:space="preserve">14.1 出荷一覧表示機能 </w:t>
+      </w:r>
+    </w:p>
+    <w:p>
+      <w:r>
+        <w:t xml:space="preserve">• 出荷テーブルに登録されている情報を一覧表として出力する。 </w:t>
+      </w:r>
+    </w:p>
+    <w:p>
+      <w:r>
+        <w:t>14.2 出荷検索機能</w:t>
+      </w:r>
+    </w:p>
+    <w:p>
+      <w:r>
+        <w:t xml:space="preserve">• 出荷IDや営業所名などを入力し出荷テーブル、出荷詳細テーブ ルから検索する。 </w:t>
+      </w:r>
+    </w:p>
+    <w:p>
+      <w:r>
+        <w:t xml:space="preserve">14.3 出荷非表示機能(フラグ) </w:t>
+      </w:r>
+    </w:p>
+    <w:p>
+      <w:r>
+        <w:t xml:space="preserve">• 選択された項目の出荷管理フラグを０から２に更新する </w:t>
+      </w:r>
+    </w:p>
+    <w:p>
+      <w:r>
+        <w:t xml:space="preserve">14.4 出荷情報確定機能(フラグ) </w:t>
+      </w:r>
+    </w:p>
+    <w:p>
+      <w:r>
+        <w:t xml:space="preserve">• 出荷が確定したタイミングで出荷状態フラグを0 から 1に更新 する。 </w:t>
+      </w:r>
+    </w:p>
+    <w:p>
+      <w:r>
+        <w:t>• 出荷テーブルの内容に基づき、売上テーブルにレコードを作成 する。</w:t>
+      </w:r>
+    </w:p>
+    <w:p/>
+    <w:p/>
+    <w:p>
+      <w:r>
+        <w:t xml:space="preserve">  </w:t>
+      </w:r>
+      <w:r>
+        <w:rPr>
+          <w:b/>
+          <w:bCs/>
+        </w:rPr>
+        <w:t>管理者</w:t>
+      </w:r>
+      <w:r>
+        <w:t xml:space="preserve">: 社員ID 1227 / パスワード 1227（生田 徳次郎） </w:t>
+      </w:r>
+    </w:p>
+    <w:p>
+      <w:r>
+        <w:t xml:space="preserve">  </w:t>
+      </w:r>
+      <w:r>
+        <w:rPr>
+          <w:b/>
+          <w:bCs/>
+        </w:rPr>
+        <w:t>営業</w:t>
+      </w:r>
+      <w:r>
+        <w:t xml:space="preserve">: 社員ID 1002 / パスワード 1002（日下部 俊夫） </w:t>
+      </w:r>
+    </w:p>
     <w:p>
       <w:pPr>
         <w:rPr>
           <w:rFonts w:hint="eastAsia"/>
         </w:rPr>
       </w:pPr>
-    </w:p>
-    <w:p>
-      <w:pPr>
-        <w:rPr>
-          <w:sz w:val="36"/>
-          <w:szCs w:val="36"/>
-        </w:rPr>
-      </w:pPr>
-      <w:r>
-        <w:rPr>
-          <w:sz w:val="36"/>
-          <w:szCs w:val="36"/>
-        </w:rPr>
-        <w:t xml:space="preserve">14.0 出荷管理 </w:t>
-      </w:r>
-    </w:p>
-    <w:p>
-      <w:r>
-        <w:t xml:space="preserve">• 商品を営業所から顧客に配達する。 </w:t>
-      </w:r>
-    </w:p>
-    <w:p>
-      <w:r>
-        <w:t xml:space="preserve">14.1 出荷一覧表示機能 </w:t>
-      </w:r>
-    </w:p>
-    <w:p>
-      <w:r>
-        <w:t xml:space="preserve">• 出荷テーブルに登録されている情報を一覧表として出力する。 </w:t>
-      </w:r>
-    </w:p>
-    <w:p>
-      <w:r>
-        <w:t>14.2 出荷検索機能</w:t>
-      </w:r>
-    </w:p>
-    <w:p>
-      <w:r>
-        <w:t xml:space="preserve">• 出荷IDや営業所名などを入力し出荷テーブル、出荷詳細テーブ ルから検索する。 </w:t>
-      </w:r>
-    </w:p>
-    <w:p>
-      <w:r>
-        <w:t xml:space="preserve">14.3 出荷非表示機能(フラグ) </w:t>
-      </w:r>
-    </w:p>
-    <w:p>
-      <w:r>
-        <w:t xml:space="preserve">• 選択された項目の出荷管理フラグを０から２に更新する </w:t>
-      </w:r>
-    </w:p>
-    <w:p>
-      <w:r>
-        <w:t xml:space="preserve">14.4 出荷情報確定機能(フラグ) </w:t>
-      </w:r>
-    </w:p>
-    <w:p>
-      <w:r>
-        <w:t xml:space="preserve">• 出荷が確定したタイミングで出荷状態フラグを0 から 1に更新 する。 </w:t>
-      </w:r>
-    </w:p>
-    <w:p>
-      <w:pPr>
-        <w:rPr>
-          <w:rFonts w:hint="eastAsia"/>
-        </w:rPr>
-      </w:pPr>
-      <w:r>
-        <w:t>• 出荷テーブルの内容に基づき、売上テーブルにレコードを作成 する。</w:t>
+      <w:r>
+        <w:t xml:space="preserve">  </w:t>
+      </w:r>
+      <w:r>
+        <w:rPr>
+          <w:b/>
+          <w:bCs/>
+        </w:rPr>
+        <w:t>物流</w:t>
+      </w:r>
+      <w:r>
+        <w:t>: 社員ID 116 / パスワード 0116（坂口 郁美）</w:t>
       </w:r>
     </w:p>
     <w:sectPr>
@@ -1847,15 +1801,15 @@
     <w:lsdException w:name="Unresolved Mention" w:semiHidden="1" w:unhideWhenUsed="1"/>
     <w:lsdException w:name="Smart Link" w:semiHidden="1" w:unhideWhenUsed="1"/>
   </w:latentStyles>
-  <w:style w:type="paragraph" w:default="1" w:styleId="a">
+  <w:style w:type="paragraph" w:default="1" w:styleId="Normal">
     <w:name w:val="Normal"/>
     <w:qFormat/>
   </w:style>
-  <w:style w:type="paragraph" w:styleId="1">
+  <w:style w:type="paragraph" w:styleId="Heading1">
     <w:name w:val="heading 1"/>
-    <w:basedOn w:val="a"/>
-    <w:next w:val="a"/>
-    <w:link w:val="10"/>
+    <w:basedOn w:val="Normal"/>
+    <w:next w:val="Normal"/>
+    <w:link w:val="Heading1Char"/>
     <w:uiPriority w:val="9"/>
     <w:qFormat/>
     <w:rsid w:val="002212D8"/>
@@ -1872,11 +1826,11 @@
       <w:szCs w:val="32"/>
     </w:rPr>
   </w:style>
-  <w:style w:type="paragraph" w:styleId="2">
+  <w:style w:type="paragraph" w:styleId="Heading2">
     <w:name w:val="heading 2"/>
-    <w:basedOn w:val="a"/>
-    <w:next w:val="a"/>
-    <w:link w:val="20"/>
+    <w:basedOn w:val="Normal"/>
+    <w:next w:val="Normal"/>
+    <w:link w:val="Heading2Char"/>
     <w:uiPriority w:val="9"/>
     <w:semiHidden/>
     <w:unhideWhenUsed/>
@@ -1895,11 +1849,11 @@
       <w:szCs w:val="28"/>
     </w:rPr>
   </w:style>
-  <w:style w:type="paragraph" w:styleId="3">
+  <w:style w:type="paragraph" w:styleId="Heading3">
     <w:name w:val="heading 3"/>
-    <w:basedOn w:val="a"/>
-    <w:next w:val="a"/>
-    <w:link w:val="30"/>
+    <w:basedOn w:val="Normal"/>
+    <w:next w:val="Normal"/>
+    <w:link w:val="Heading3Char"/>
     <w:uiPriority w:val="9"/>
     <w:semiHidden/>
     <w:unhideWhenUsed/>
@@ -1918,11 +1872,11 @@
       <w:szCs w:val="24"/>
     </w:rPr>
   </w:style>
-  <w:style w:type="paragraph" w:styleId="4">
+  <w:style w:type="paragraph" w:styleId="Heading4">
     <w:name w:val="heading 4"/>
-    <w:basedOn w:val="a"/>
-    <w:next w:val="a"/>
-    <w:link w:val="40"/>
+    <w:basedOn w:val="Normal"/>
+    <w:next w:val="Normal"/>
+    <w:link w:val="Heading4Char"/>
     <w:uiPriority w:val="9"/>
     <w:semiHidden/>
     <w:unhideWhenUsed/>
@@ -1939,11 +1893,11 @@
       <w:color w:val="000000" w:themeColor="text1"/>
     </w:rPr>
   </w:style>
-  <w:style w:type="paragraph" w:styleId="5">
+  <w:style w:type="paragraph" w:styleId="Heading5">
     <w:name w:val="heading 5"/>
-    <w:basedOn w:val="a"/>
-    <w:next w:val="a"/>
-    <w:link w:val="50"/>
+    <w:basedOn w:val="Normal"/>
+    <w:next w:val="Normal"/>
+    <w:link w:val="Heading5Char"/>
     <w:uiPriority w:val="9"/>
     <w:semiHidden/>
     <w:unhideWhenUsed/>
@@ -1961,11 +1915,11 @@
       <w:color w:val="000000" w:themeColor="text1"/>
     </w:rPr>
   </w:style>
-  <w:style w:type="paragraph" w:styleId="6">
+  <w:style w:type="paragraph" w:styleId="Heading6">
     <w:name w:val="heading 6"/>
-    <w:basedOn w:val="a"/>
-    <w:next w:val="a"/>
-    <w:link w:val="60"/>
+    <w:basedOn w:val="Normal"/>
+    <w:next w:val="Normal"/>
+    <w:link w:val="Heading6Char"/>
     <w:uiPriority w:val="9"/>
     <w:semiHidden/>
     <w:unhideWhenUsed/>
@@ -1983,11 +1937,11 @@
       <w:color w:val="000000" w:themeColor="text1"/>
     </w:rPr>
   </w:style>
-  <w:style w:type="paragraph" w:styleId="7">
+  <w:style w:type="paragraph" w:styleId="Heading7">
     <w:name w:val="heading 7"/>
-    <w:basedOn w:val="a"/>
-    <w:next w:val="a"/>
-    <w:link w:val="70"/>
+    <w:basedOn w:val="Normal"/>
+    <w:next w:val="Normal"/>
+    <w:link w:val="Heading7Char"/>
     <w:uiPriority w:val="9"/>
     <w:semiHidden/>
     <w:unhideWhenUsed/>
@@ -2005,11 +1959,11 @@
       <w:color w:val="000000" w:themeColor="text1"/>
     </w:rPr>
   </w:style>
-  <w:style w:type="paragraph" w:styleId="8">
+  <w:style w:type="paragraph" w:styleId="Heading8">
     <w:name w:val="heading 8"/>
-    <w:basedOn w:val="a"/>
-    <w:next w:val="a"/>
-    <w:link w:val="80"/>
+    <w:basedOn w:val="Normal"/>
+    <w:next w:val="Normal"/>
+    <w:link w:val="Heading8Char"/>
     <w:uiPriority w:val="9"/>
     <w:semiHidden/>
     <w:unhideWhenUsed/>
@@ -2027,11 +1981,11 @@
       <w:color w:val="000000" w:themeColor="text1"/>
     </w:rPr>
   </w:style>
-  <w:style w:type="paragraph" w:styleId="9">
+  <w:style w:type="paragraph" w:styleId="Heading9">
     <w:name w:val="heading 9"/>
-    <w:basedOn w:val="a"/>
-    <w:next w:val="a"/>
-    <w:link w:val="90"/>
+    <w:basedOn w:val="Normal"/>
+    <w:next w:val="Normal"/>
+    <w:link w:val="Heading9Char"/>
     <w:uiPriority w:val="9"/>
     <w:semiHidden/>
     <w:unhideWhenUsed/>
@@ -2049,12 +2003,12 @@
       <w:color w:val="000000" w:themeColor="text1"/>
     </w:rPr>
   </w:style>
-  <w:style w:type="character" w:default="1" w:styleId="a0">
+  <w:style w:type="character" w:default="1" w:styleId="DefaultParagraphFont">
     <w:name w:val="Default Paragraph Font"/>
     <w:uiPriority w:val="1"/>
     <w:unhideWhenUsed/>
   </w:style>
-  <w:style w:type="table" w:default="1" w:styleId="a1">
+  <w:style w:type="table" w:default="1" w:styleId="TableNormal">
     <w:name w:val="Normal Table"/>
     <w:uiPriority w:val="99"/>
     <w:semiHidden/>
@@ -2069,16 +2023,16 @@
       </w:tblCellMar>
     </w:tblPr>
   </w:style>
-  <w:style w:type="numbering" w:default="1" w:styleId="a2">
+  <w:style w:type="numbering" w:default="1" w:styleId="NoList">
     <w:name w:val="No List"/>
     <w:uiPriority w:val="99"/>
     <w:semiHidden/>
     <w:unhideWhenUsed/>
   </w:style>
-  <w:style w:type="character" w:customStyle="1" w:styleId="10">
-    <w:name w:val="見出し 1 (文字)"/>
-    <w:basedOn w:val="a0"/>
-    <w:link w:val="1"/>
+  <w:style w:type="character" w:customStyle="1" w:styleId="Heading1Char">
+    <w:name w:val="Heading 1 Char"/>
+    <w:basedOn w:val="DefaultParagraphFont"/>
+    <w:link w:val="Heading1"/>
     <w:uiPriority w:val="9"/>
     <w:rsid w:val="002212D8"/>
     <w:rPr>
@@ -2088,10 +2042,10 @@
       <w:szCs w:val="32"/>
     </w:rPr>
   </w:style>
-  <w:style w:type="character" w:customStyle="1" w:styleId="20">
-    <w:name w:val="見出し 2 (文字)"/>
-    <w:basedOn w:val="a0"/>
-    <w:link w:val="2"/>
+  <w:style w:type="character" w:customStyle="1" w:styleId="Heading2Char">
+    <w:name w:val="Heading 2 Char"/>
+    <w:basedOn w:val="DefaultParagraphFont"/>
+    <w:link w:val="Heading2"/>
     <w:uiPriority w:val="9"/>
     <w:semiHidden/>
     <w:rsid w:val="002212D8"/>
@@ -2102,10 +2056,10 @@
       <w:szCs w:val="28"/>
     </w:rPr>
   </w:style>
-  <w:style w:type="character" w:customStyle="1" w:styleId="30">
-    <w:name w:val="見出し 3 (文字)"/>
-    <w:basedOn w:val="a0"/>
-    <w:link w:val="3"/>
+  <w:style w:type="character" w:customStyle="1" w:styleId="Heading3Char">
+    <w:name w:val="Heading 3 Char"/>
+    <w:basedOn w:val="DefaultParagraphFont"/>
+    <w:link w:val="Heading3"/>
     <w:uiPriority w:val="9"/>
     <w:semiHidden/>
     <w:rsid w:val="002212D8"/>
@@ -2116,10 +2070,10 @@
       <w:szCs w:val="24"/>
     </w:rPr>
   </w:style>
-  <w:style w:type="character" w:customStyle="1" w:styleId="40">
-    <w:name w:val="見出し 4 (文字)"/>
-    <w:basedOn w:val="a0"/>
-    <w:link w:val="4"/>
+  <w:style w:type="character" w:customStyle="1" w:styleId="Heading4Char">
+    <w:name w:val="Heading 4 Char"/>
+    <w:basedOn w:val="DefaultParagraphFont"/>
+    <w:link w:val="Heading4"/>
     <w:uiPriority w:val="9"/>
     <w:semiHidden/>
     <w:rsid w:val="002212D8"/>
@@ -2128,10 +2082,10 @@
       <w:color w:val="000000" w:themeColor="text1"/>
     </w:rPr>
   </w:style>
-  <w:style w:type="character" w:customStyle="1" w:styleId="50">
-    <w:name w:val="見出し 5 (文字)"/>
-    <w:basedOn w:val="a0"/>
-    <w:link w:val="5"/>
+  <w:style w:type="character" w:customStyle="1" w:styleId="Heading5Char">
+    <w:name w:val="Heading 5 Char"/>
+    <w:basedOn w:val="DefaultParagraphFont"/>
+    <w:link w:val="Heading5"/>
     <w:uiPriority w:val="9"/>
     <w:semiHidden/>
     <w:rsid w:val="002212D8"/>
@@ -2140,10 +2094,10 @@
       <w:color w:val="000000" w:themeColor="text1"/>
     </w:rPr>
   </w:style>
-  <w:style w:type="character" w:customStyle="1" w:styleId="60">
-    <w:name w:val="見出し 6 (文字)"/>
-    <w:basedOn w:val="a0"/>
-    <w:link w:val="6"/>
+  <w:style w:type="character" w:customStyle="1" w:styleId="Heading6Char">
+    <w:name w:val="Heading 6 Char"/>
+    <w:basedOn w:val="DefaultParagraphFont"/>
+    <w:link w:val="Heading6"/>
     <w:uiPriority w:val="9"/>
     <w:semiHidden/>
     <w:rsid w:val="002212D8"/>
@@ -2152,10 +2106,10 @@
       <w:color w:val="000000" w:themeColor="text1"/>
     </w:rPr>
   </w:style>
-  <w:style w:type="character" w:customStyle="1" w:styleId="70">
-    <w:name w:val="見出し 7 (文字)"/>
-    <w:basedOn w:val="a0"/>
-    <w:link w:val="7"/>
+  <w:style w:type="character" w:customStyle="1" w:styleId="Heading7Char">
+    <w:name w:val="Heading 7 Char"/>
+    <w:basedOn w:val="DefaultParagraphFont"/>
+    <w:link w:val="Heading7"/>
     <w:uiPriority w:val="9"/>
     <w:semiHidden/>
     <w:rsid w:val="002212D8"/>
@@ -2164,10 +2118,10 @@
       <w:color w:val="000000" w:themeColor="text1"/>
     </w:rPr>
   </w:style>
-  <w:style w:type="character" w:customStyle="1" w:styleId="80">
-    <w:name w:val="見出し 8 (文字)"/>
-    <w:basedOn w:val="a0"/>
-    <w:link w:val="8"/>
+  <w:style w:type="character" w:customStyle="1" w:styleId="Heading8Char">
+    <w:name w:val="Heading 8 Char"/>
+    <w:basedOn w:val="DefaultParagraphFont"/>
+    <w:link w:val="Heading8"/>
     <w:uiPriority w:val="9"/>
     <w:semiHidden/>
     <w:rsid w:val="002212D8"/>
@@ -2176,10 +2130,10 @@
       <w:color w:val="000000" w:themeColor="text1"/>
     </w:rPr>
   </w:style>
-  <w:style w:type="character" w:customStyle="1" w:styleId="90">
-    <w:name w:val="見出し 9 (文字)"/>
-    <w:basedOn w:val="a0"/>
-    <w:link w:val="9"/>
+  <w:style w:type="character" w:customStyle="1" w:styleId="Heading9Char">
+    <w:name w:val="Heading 9 Char"/>
+    <w:basedOn w:val="DefaultParagraphFont"/>
+    <w:link w:val="Heading9"/>
     <w:uiPriority w:val="9"/>
     <w:semiHidden/>
     <w:rsid w:val="002212D8"/>
@@ -2188,11 +2142,11 @@
       <w:color w:val="000000" w:themeColor="text1"/>
     </w:rPr>
   </w:style>
-  <w:style w:type="paragraph" w:styleId="a3">
+  <w:style w:type="paragraph" w:styleId="Title">
     <w:name w:val="Title"/>
-    <w:basedOn w:val="a"/>
-    <w:next w:val="a"/>
-    <w:link w:val="a4"/>
+    <w:basedOn w:val="Normal"/>
+    <w:next w:val="Normal"/>
+    <w:link w:val="TitleChar"/>
     <w:uiPriority w:val="10"/>
     <w:qFormat/>
     <w:rsid w:val="002212D8"/>
@@ -2209,10 +2163,10 @@
       <w:szCs w:val="56"/>
     </w:rPr>
   </w:style>
-  <w:style w:type="character" w:customStyle="1" w:styleId="a4">
-    <w:name w:val="表題 (文字)"/>
-    <w:basedOn w:val="a0"/>
-    <w:link w:val="a3"/>
+  <w:style w:type="character" w:customStyle="1" w:styleId="TitleChar">
+    <w:name w:val="Title Char"/>
+    <w:basedOn w:val="DefaultParagraphFont"/>
+    <w:link w:val="Title"/>
     <w:uiPriority w:val="10"/>
     <w:rsid w:val="002212D8"/>
     <w:rPr>
@@ -2223,11 +2177,11 @@
       <w:szCs w:val="56"/>
     </w:rPr>
   </w:style>
-  <w:style w:type="paragraph" w:styleId="a5">
+  <w:style w:type="paragraph" w:styleId="Subtitle">
     <w:name w:val="Subtitle"/>
-    <w:basedOn w:val="a"/>
-    <w:next w:val="a"/>
-    <w:link w:val="a6"/>
+    <w:basedOn w:val="Normal"/>
+    <w:next w:val="Normal"/>
+    <w:link w:val="SubtitleChar"/>
     <w:uiPriority w:val="11"/>
     <w:qFormat/>
     <w:rsid w:val="002212D8"/>
@@ -2246,10 +2200,10 @@
       <w:szCs w:val="28"/>
     </w:rPr>
   </w:style>
-  <w:style w:type="character" w:customStyle="1" w:styleId="a6">
-    <w:name w:val="副題 (文字)"/>
-    <w:basedOn w:val="a0"/>
-    <w:link w:val="a5"/>
+  <w:style w:type="character" w:customStyle="1" w:styleId="SubtitleChar">
+    <w:name w:val="Subtitle Char"/>
+    <w:basedOn w:val="DefaultParagraphFont"/>
+    <w:link w:val="Subtitle"/>
     <w:uiPriority w:val="11"/>
     <w:rsid w:val="002212D8"/>
     <w:rPr>
@@ -2260,11 +2214,11 @@
       <w:szCs w:val="28"/>
     </w:rPr>
   </w:style>
-  <w:style w:type="paragraph" w:styleId="a7">
+  <w:style w:type="paragraph" w:styleId="Quote">
     <w:name w:val="Quote"/>
-    <w:basedOn w:val="a"/>
-    <w:next w:val="a"/>
-    <w:link w:val="a8"/>
+    <w:basedOn w:val="Normal"/>
+    <w:next w:val="Normal"/>
+    <w:link w:val="QuoteChar"/>
     <w:uiPriority w:val="29"/>
     <w:qFormat/>
     <w:rsid w:val="002212D8"/>
@@ -2278,10 +2232,10 @@
       <w:color w:val="404040" w:themeColor="text1" w:themeTint="BF"/>
     </w:rPr>
   </w:style>
-  <w:style w:type="character" w:customStyle="1" w:styleId="a8">
-    <w:name w:val="引用文 (文字)"/>
-    <w:basedOn w:val="a0"/>
-    <w:link w:val="a7"/>
+  <w:style w:type="character" w:customStyle="1" w:styleId="QuoteChar">
+    <w:name w:val="Quote Char"/>
+    <w:basedOn w:val="DefaultParagraphFont"/>
+    <w:link w:val="Quote"/>
     <w:uiPriority w:val="29"/>
     <w:rsid w:val="002212D8"/>
     <w:rPr>
@@ -2290,9 +2244,9 @@
       <w:color w:val="404040" w:themeColor="text1" w:themeTint="BF"/>
     </w:rPr>
   </w:style>
-  <w:style w:type="paragraph" w:styleId="a9">
+  <w:style w:type="paragraph" w:styleId="ListParagraph">
     <w:name w:val="List Paragraph"/>
-    <w:basedOn w:val="a"/>
+    <w:basedOn w:val="Normal"/>
     <w:uiPriority w:val="34"/>
     <w:qFormat/>
     <w:rsid w:val="002212D8"/>
@@ -2301,9 +2255,9 @@
       <w:contextualSpacing/>
     </w:pPr>
   </w:style>
-  <w:style w:type="character" w:styleId="21">
+  <w:style w:type="character" w:styleId="IntenseEmphasis">
     <w:name w:val="Intense Emphasis"/>
-    <w:basedOn w:val="a0"/>
+    <w:basedOn w:val="DefaultParagraphFont"/>
     <w:uiPriority w:val="21"/>
     <w:qFormat/>
     <w:rsid w:val="002212D8"/>
@@ -2313,11 +2267,11 @@
       <w:color w:val="0F4761" w:themeColor="accent1" w:themeShade="BF"/>
     </w:rPr>
   </w:style>
-  <w:style w:type="paragraph" w:styleId="22">
+  <w:style w:type="paragraph" w:styleId="IntenseQuote">
     <w:name w:val="Intense Quote"/>
-    <w:basedOn w:val="a"/>
-    <w:next w:val="a"/>
-    <w:link w:val="23"/>
+    <w:basedOn w:val="Normal"/>
+    <w:next w:val="Normal"/>
+    <w:link w:val="IntenseQuoteChar"/>
     <w:uiPriority w:val="30"/>
     <w:qFormat/>
     <w:rsid w:val="002212D8"/>
@@ -2336,10 +2290,10 @@
       <w:color w:val="0F4761" w:themeColor="accent1" w:themeShade="BF"/>
     </w:rPr>
   </w:style>
-  <w:style w:type="character" w:customStyle="1" w:styleId="23">
-    <w:name w:val="引用文 2 (文字)"/>
-    <w:basedOn w:val="a0"/>
-    <w:link w:val="22"/>
+  <w:style w:type="character" w:customStyle="1" w:styleId="IntenseQuoteChar">
+    <w:name w:val="Intense Quote Char"/>
+    <w:basedOn w:val="DefaultParagraphFont"/>
+    <w:link w:val="IntenseQuote"/>
     <w:uiPriority w:val="30"/>
     <w:rsid w:val="002212D8"/>
     <w:rPr>
@@ -2348,9 +2302,9 @@
       <w:color w:val="0F4761" w:themeColor="accent1" w:themeShade="BF"/>
     </w:rPr>
   </w:style>
-  <w:style w:type="character" w:styleId="24">
+  <w:style w:type="character" w:styleId="IntenseReference">
     <w:name w:val="Intense Reference"/>
-    <w:basedOn w:val="a0"/>
+    <w:basedOn w:val="DefaultParagraphFont"/>
     <w:uiPriority w:val="32"/>
     <w:qFormat/>
     <w:rsid w:val="002212D8"/>

</xml_diff>